<commit_message>
Relecture ciblée des ajouts : corrections de fidélité des citations
Relecture 'delta' du seul matériel nouveau (Discussion + sous-section de
littérature + 7 références). Trois corrections de fidélité appliquées :

- Pauwels et Neslin (2015) : la cannibalisation des autres canaux existe
  mais est compensée (CA net +20 %) ; formulation corrigée en
  'complémentarité l'emportant sur la cannibalisation'.
- Harris et al. (2018) : la dynamique temporelle n'est pas établie par
  une étude transversale ; 'évolue dans le temps' remplacé par 'diffère
  d'une situation à l'autre'.
- Hai Tran et Sirieix (2020) : citation de soutien allégée (retrait d'un
  positionnement méta-théorique non explicitement le leur).

Aucune sur-interprétation résiduelle ; cohérence interne préservée.
Post-correction : 7 986 mots, 29 références, traçabilité 124/124.

Co-Authored-By: Claude Opus 4.8 <noreply@anthropic.com>
Claude-Session: https://claude.ai/code/session_01GPMhaLyMn13E1D3y8GrY2W
</commit_message>
<xml_diff>
--- a/outputs/soumission_DM/1_manuscrit_anonymise_DM.docx
+++ b/outputs/soumission_DM/1_manuscrit_anonymise_DM.docx
@@ -661,7 +661,7 @@
         <w:t xml:space="preserve"> </w:t>
       </w:r>
       <w:r>
-        <w:t xml:space="preserve">— chaque format pour la fonction qu’il remplit le mieux (produits frais, dépannage, achats de gros) —, et non d’une fidélité générale à l’un d’eux ; Hai Tran et Sirieix (2020) déplacent de même le regard des attributs de l’enseigne vers les pratiques du consommateur. Vroegrijk et al. (2013) observent que ce sont les ménages déjà multi-enseignes qui adoptent un nouveau format en</w:t>
+        <w:t xml:space="preserve">— chaque format pour la fonction qu’il remplit le mieux (produits frais, dépannage, achats de gros) —, et non d’une fidélité générale à l’un d’eux ; Hai Tran et Sirieix (2020) documentent de même ces combinaisons de circuits du point de vue des pratiques d’achat. Vroegrijk et al. (2013) observent que ce sont les ménages déjà multi-enseignes qui adoptent un nouveau format en</w:t>
       </w:r>
       <w:r>
         <w:t xml:space="preserve"> </w:t>
@@ -677,7 +677,7 @@
         <w:t xml:space="preserve"> </w:t>
       </w:r>
       <w:r>
-        <w:t xml:space="preserve">de leurs points de vente habituels, et Melis et al. (2016) que l’ajout d’un canal peut élargir la part de portefeuille captée par une enseigne plutôt que la redistribuer entre canaux existants. La théorie des buts (Harris et al., 2018, 2021) ajoute un second niveau d’explication : la configuration du parcours d’achat d’un même ménage varie selon la</w:t>
+        <w:t xml:space="preserve">de leurs points de vente habituels, et Melis et al. (2016) que l’ajout d’un canal peut élargir la part de portefeuille captée par une enseigne plutôt que la redistribuer entre canaux existants. La théorie des buts (Harris et al., 2018, 2021) ajoute un second niveau d’explication : la configuration du parcours d’achat varie selon la</w:t>
       </w:r>
       <w:r>
         <w:t xml:space="preserve"> </w:t>
@@ -693,7 +693,7 @@
         <w:t xml:space="preserve"> </w:t>
       </w:r>
       <w:r>
-        <w:t xml:space="preserve">— abstraits (être un consommateur responsable) ou concrets (dépanner un repas) — active à un instant donné, et cette hiérarchie évolue dans le temps. Appliqué à la vente directe, ce cadre suggère qu’y recourir dépend moins d’un profil de consommateur stable que d’une</w:t>
+        <w:t xml:space="preserve">— abstraits (être un consommateur responsable) ou concrets (dépanner un repas) — active dans un contexte d’achat donné, et diffère d’une situation à l’autre pour un même ménage. Appliqué à la vente directe, ce cadre suggère qu’y recourir dépend moins d’un profil de consommateur stable que d’une</w:t>
       </w:r>
       <w:r>
         <w:t xml:space="preserve"> </w:t>
@@ -4493,7 +4493,7 @@
         <w:t xml:space="preserve"> </w:t>
       </w:r>
       <w:r>
-        <w:t xml:space="preserve">des canaux. De même que l’ouverture d’un magasin physique accroît le chiffre d’affaires total d’un distributeur — de l’ordre de 20 % — plutôt qu’elle ne cannibalise ses autres canaux (Pauwels et Neslin, 2015), la vente directe fonctionne, à l’échelle du ménage, comme un canal</w:t>
+        <w:t xml:space="preserve">des canaux. De même que l’ouverture de magasins physiques accroît le chiffre d’affaires total d’un distributeur — de l’ordre de 20 % —, la logique de complémentarité l’emportant sur la cannibalisation de ses autres canaux (Pauwels et Neslin, 2015), la vente directe fonctionne, à l’échelle du ménage, comme un canal</w:t>
       </w:r>
       <w:r>
         <w:t xml:space="preserve"> </w:t>

</xml_diff>